<commit_message>
Add O2O buy-physical-get-virtual-voucher section to the MOMO proposal
Adds a new section describing the O2O mechanic from the original
proposal report (MOMO purchase triggers a virtual voucher redeemable
at Alpha's physical stores), positioned as a third pillar alongside
the campaign markup and commission-cut ask. Includes the customer
flow, suggested rollout timing (9th-anniversary first), and the
coordination needed with MOMO and the ticket vendor (宜叡). Renumbers
subsequent sections and folds the ask into the MOMO resource-request
list.

Co-Authored-By: Claude Sonnet 5 <noreply@anthropic.com>
Claude-Session: https://claude.ai/code/session_017MkXzc3f6C9kF9xrysbHQH
</commit_message>
<xml_diff>
--- a/MOMO渠道合作初步方案（九週年慶x雙十一加碼計畫）.docx
+++ b/MOMO渠道合作初步方案（九週年慶x雙十一加碼計畫）.docx
@@ -101,7 +101,7 @@
           <w:sz w:val="21"/>
           <w:szCs w:val="21"/>
         </w:rPr>
-        <w:t xml:space="preserve">延續雙方初步洽談之核心合作架構——MOMO 平台抽成由 26.5% 調降至 10.0%，差額 16.5% 由阿爾法以 1:1 比例全數回投站內外行銷——本方案進一步鎖定下半年度兩大關鍵檔期，由阿爾法額外加碼投入行銷預算，主動衝高檔期業績，並期待 MOMO 同步提供對應曝光資源，讓雙方在檔期期間創造更大綜效。</w:t>
+        <w:t xml:space="preserve">延續雙方初步洽談之核心合作架構——MOMO 平台抽成由 26.5% 調降至 10.0%，差額 16.5% 由阿爾法以 1:1 比例全數回投站內外行銷——本方案進一步結合三項操作，鎖定下半年度兩大關鍵檔期創造綜效：(1) 阿爾法額外加碼投入檔期行銷預算，主動衝高檔期業績；(2) 期待 MOMO 同步提供對應曝光資源；(3) 於 MOMO 平台導入「買實體送虛擬」O2O 機制，將線上訂單導流至阿爾法實體門店，串連線上線下雙渠道。</w:t>
       </w:r>
     </w:p>
     <w:p>
@@ -667,7 +667,381 @@
           <w:sz w:val="30"/>
           <w:szCs w:val="30"/>
         </w:rPr>
-        <w:t xml:space="preserve">三、逐月測算總表（含檔期加碼）</w:t>
+        <w:t xml:space="preserve">三、O2O 導流合作方案（買實體送虛擬）</w:t>
+      </w:r>
+    </w:p>
+    <w:p>
+      <w:pPr>
+        <w:spacing w:after="160" w:line="320"/>
+      </w:pPr>
+      <w:r>
+        <w:rPr>
+          <w:rFonts w:ascii="Microsoft JhengHei" w:cs="Microsoft JhengHei" w:eastAsia="Microsoft JhengHei" w:hAnsi="Microsoft JhengHei"/>
+          <w:b w:val="false"/>
+          <w:bCs w:val="false"/>
+          <w:i w:val="false"/>
+          <w:iCs w:val="false"/>
+          <w:color w:val="26221D"/>
+          <w:sz w:val="21"/>
+          <w:szCs w:val="21"/>
+        </w:rPr>
+        <w:t xml:space="preserve">在兩大檔期加碼衝業績的同時，進一步導入「買實體送虛擬」機制，將 MOMO 平台的線上訂單流量，精準導回阿爾法餐飲之實體門店，創造線上線下雙渠道互動，並為門店帶來額外增量客流。</w:t>
+      </w:r>
+    </w:p>
+    <w:tbl>
+      <w:tblPr>
+        <w:tblW w:type="dxa" w:w="9350"/>
+        <w:tblBorders>
+          <w:top w:val="single" w:color="DDD6C7" w:sz="4"/>
+          <w:left w:val="single" w:color="DDD6C7" w:sz="4"/>
+          <w:bottom w:val="single" w:color="DDD6C7" w:sz="4"/>
+          <w:right w:val="single" w:color="DDD6C7" w:sz="4"/>
+          <w:insideH w:val="single" w:color="DDD6C7" w:sz="4"/>
+          <w:insideV w:val="single" w:color="DDD6C7" w:sz="4"/>
+        </w:tblBorders>
+      </w:tblPr>
+      <w:tblGrid>
+        <w:gridCol w:w="900"/>
+        <w:gridCol w:w="8450"/>
+      </w:tblGrid>
+      <w:tr>
+        <w:trPr>
+          <w:tblHeader/>
+        </w:trPr>
+        <w:tc>
+          <w:tcPr>
+            <w:tcW w:type="dxa" w:w="900"/>
+            <w:shd w:fill="0E8F62" w:val="clear"/>
+            <w:tcMar>
+              <w:top w:type="dxa" w:w="90"/>
+              <w:left w:type="dxa" w:w="120"/>
+              <w:bottom w:type="dxa" w:w="90"/>
+              <w:right w:type="dxa" w:w="120"/>
+            </w:tcMar>
+            <w:vAlign w:val="center"/>
+          </w:tcPr>
+          <w:p>
+            <w:pPr>
+              <w:jc w:val="center"/>
+            </w:pPr>
+            <w:r>
+              <w:rPr>
+                <w:rFonts w:ascii="Microsoft JhengHei" w:cs="Microsoft JhengHei" w:eastAsia="Microsoft JhengHei" w:hAnsi="Microsoft JhengHei"/>
+                <w:b/>
+                <w:bCs/>
+                <w:color w:val="FFFFFF"/>
+                <w:sz w:val="20"/>
+                <w:szCs w:val="20"/>
+              </w:rPr>
+              <w:t xml:space="preserve">步驟</w:t>
+            </w:r>
+          </w:p>
+        </w:tc>
+        <w:tc>
+          <w:tcPr>
+            <w:tcW w:type="dxa" w:w="8450"/>
+            <w:shd w:fill="0E8F62" w:val="clear"/>
+            <w:tcMar>
+              <w:top w:type="dxa" w:w="90"/>
+              <w:left w:type="dxa" w:w="120"/>
+              <w:bottom w:type="dxa" w:w="90"/>
+              <w:right w:type="dxa" w:w="120"/>
+            </w:tcMar>
+            <w:vAlign w:val="center"/>
+          </w:tcPr>
+          <w:p>
+            <w:pPr>
+              <w:jc w:val="left"/>
+            </w:pPr>
+            <w:r>
+              <w:rPr>
+                <w:rFonts w:ascii="Microsoft JhengHei" w:cs="Microsoft JhengHei" w:eastAsia="Microsoft JhengHei" w:hAnsi="Microsoft JhengHei"/>
+                <w:b/>
+                <w:bCs/>
+                <w:color w:val="FFFFFF"/>
+                <w:sz w:val="20"/>
+                <w:szCs w:val="20"/>
+              </w:rPr>
+              <w:t xml:space="preserve">內容</w:t>
+            </w:r>
+          </w:p>
+        </w:tc>
+      </w:tr>
+      <w:tr>
+        <w:tc>
+          <w:tcPr>
+            <w:tcW w:type="dxa" w:w="900"/>
+            <w:tcMar>
+              <w:top w:type="dxa" w:w="90"/>
+              <w:left w:type="dxa" w:w="120"/>
+              <w:bottom w:type="dxa" w:w="90"/>
+              <w:right w:type="dxa" w:w="120"/>
+            </w:tcMar>
+            <w:vAlign w:val="center"/>
+          </w:tcPr>
+          <w:p>
+            <w:pPr>
+              <w:jc w:val="center"/>
+            </w:pPr>
+            <w:r>
+              <w:rPr>
+                <w:rFonts w:ascii="Microsoft JhengHei" w:cs="Microsoft JhengHei" w:eastAsia="Microsoft JhengHei" w:hAnsi="Microsoft JhengHei"/>
+                <w:color w:val="26221D"/>
+                <w:sz w:val="20"/>
+                <w:szCs w:val="20"/>
+              </w:rPr>
+              <w:t xml:space="preserve">1</w:t>
+            </w:r>
+          </w:p>
+        </w:tc>
+        <w:tc>
+          <w:tcPr>
+            <w:tcW w:type="dxa" w:w="8450"/>
+            <w:tcMar>
+              <w:top w:type="dxa" w:w="90"/>
+              <w:left w:type="dxa" w:w="120"/>
+              <w:bottom w:type="dxa" w:w="90"/>
+              <w:right w:type="dxa" w:w="120"/>
+            </w:tcMar>
+            <w:vAlign w:val="center"/>
+          </w:tcPr>
+          <w:p>
+            <w:pPr>
+              <w:jc w:val="left"/>
+            </w:pPr>
+            <w:r>
+              <w:rPr>
+                <w:rFonts w:ascii="Microsoft JhengHei" w:cs="Microsoft JhengHei" w:eastAsia="Microsoft JhengHei" w:hAnsi="Microsoft JhengHei"/>
+                <w:color w:val="26221D"/>
+                <w:sz w:val="20"/>
+                <w:szCs w:val="20"/>
+              </w:rPr>
+              <w:t xml:space="preserve">消費者於 MOMO 平台購買阿爾法零售商品（如雞湯大叔雞湯包、滴雞精等）</w:t>
+            </w:r>
+          </w:p>
+        </w:tc>
+      </w:tr>
+      <w:tr>
+        <w:tc>
+          <w:tcPr>
+            <w:tcW w:type="dxa" w:w="900"/>
+            <w:shd w:fill="FBFAF6" w:val="clear"/>
+            <w:tcMar>
+              <w:top w:type="dxa" w:w="90"/>
+              <w:left w:type="dxa" w:w="120"/>
+              <w:bottom w:type="dxa" w:w="90"/>
+              <w:right w:type="dxa" w:w="120"/>
+            </w:tcMar>
+            <w:vAlign w:val="center"/>
+          </w:tcPr>
+          <w:p>
+            <w:pPr>
+              <w:jc w:val="center"/>
+            </w:pPr>
+            <w:r>
+              <w:rPr>
+                <w:rFonts w:ascii="Microsoft JhengHei" w:cs="Microsoft JhengHei" w:eastAsia="Microsoft JhengHei" w:hAnsi="Microsoft JhengHei"/>
+                <w:color w:val="26221D"/>
+                <w:sz w:val="20"/>
+                <w:szCs w:val="20"/>
+              </w:rPr>
+              <w:t xml:space="preserve">2</w:t>
+            </w:r>
+          </w:p>
+        </w:tc>
+        <w:tc>
+          <w:tcPr>
+            <w:tcW w:type="dxa" w:w="8450"/>
+            <w:shd w:fill="FBFAF6" w:val="clear"/>
+            <w:tcMar>
+              <w:top w:type="dxa" w:w="90"/>
+              <w:left w:type="dxa" w:w="120"/>
+              <w:bottom w:type="dxa" w:w="90"/>
+              <w:right w:type="dxa" w:w="120"/>
+            </w:tcMar>
+            <w:vAlign w:val="center"/>
+          </w:tcPr>
+          <w:p>
+            <w:pPr>
+              <w:jc w:val="left"/>
+            </w:pPr>
+            <w:r>
+              <w:rPr>
+                <w:rFonts w:ascii="Microsoft JhengHei" w:cs="Microsoft JhengHei" w:eastAsia="Microsoft JhengHei" w:hAnsi="Microsoft JhengHei"/>
+                <w:color w:val="26221D"/>
+                <w:sz w:val="20"/>
+                <w:szCs w:val="20"/>
+              </w:rPr>
+              <w:t xml:space="preserve">訂單成立後，系統自動發送「阿爾法餐飲門店虛擬折抵券／兌換券」至消費者 MOMO 會員帳戶</w:t>
+            </w:r>
+          </w:p>
+        </w:tc>
+      </w:tr>
+      <w:tr>
+        <w:tc>
+          <w:tcPr>
+            <w:tcW w:type="dxa" w:w="900"/>
+            <w:tcMar>
+              <w:top w:type="dxa" w:w="90"/>
+              <w:left w:type="dxa" w:w="120"/>
+              <w:bottom w:type="dxa" w:w="90"/>
+              <w:right w:type="dxa" w:w="120"/>
+            </w:tcMar>
+            <w:vAlign w:val="center"/>
+          </w:tcPr>
+          <w:p>
+            <w:pPr>
+              <w:jc w:val="center"/>
+            </w:pPr>
+            <w:r>
+              <w:rPr>
+                <w:rFonts w:ascii="Microsoft JhengHei" w:cs="Microsoft JhengHei" w:eastAsia="Microsoft JhengHei" w:hAnsi="Microsoft JhengHei"/>
+                <w:color w:val="26221D"/>
+                <w:sz w:val="20"/>
+                <w:szCs w:val="20"/>
+              </w:rPr>
+              <w:t xml:space="preserve">3</w:t>
+            </w:r>
+          </w:p>
+        </w:tc>
+        <w:tc>
+          <w:tcPr>
+            <w:tcW w:type="dxa" w:w="8450"/>
+            <w:tcMar>
+              <w:top w:type="dxa" w:w="90"/>
+              <w:left w:type="dxa" w:w="120"/>
+              <w:bottom w:type="dxa" w:w="90"/>
+              <w:right w:type="dxa" w:w="120"/>
+            </w:tcMar>
+            <w:vAlign w:val="center"/>
+          </w:tcPr>
+          <w:p>
+            <w:pPr>
+              <w:jc w:val="left"/>
+            </w:pPr>
+            <w:r>
+              <w:rPr>
+                <w:rFonts w:ascii="Microsoft JhengHei" w:cs="Microsoft JhengHei" w:eastAsia="Microsoft JhengHei" w:hAnsi="Microsoft JhengHei"/>
+                <w:color w:val="26221D"/>
+                <w:sz w:val="20"/>
+                <w:szCs w:val="20"/>
+              </w:rPr>
+              <w:t xml:space="preserve">消費者持券至全台雞湯大叔、賴山嶼等阿爾法實體門店消費並完成兌換折抵</w:t>
+            </w:r>
+          </w:p>
+        </w:tc>
+      </w:tr>
+      <w:tr>
+        <w:tc>
+          <w:tcPr>
+            <w:tcW w:type="dxa" w:w="900"/>
+            <w:shd w:fill="FBFAF6" w:val="clear"/>
+            <w:tcMar>
+              <w:top w:type="dxa" w:w="90"/>
+              <w:left w:type="dxa" w:w="120"/>
+              <w:bottom w:type="dxa" w:w="90"/>
+              <w:right w:type="dxa" w:w="120"/>
+            </w:tcMar>
+            <w:vAlign w:val="center"/>
+          </w:tcPr>
+          <w:p>
+            <w:pPr>
+              <w:jc w:val="center"/>
+            </w:pPr>
+            <w:r>
+              <w:rPr>
+                <w:rFonts w:ascii="Microsoft JhengHei" w:cs="Microsoft JhengHei" w:eastAsia="Microsoft JhengHei" w:hAnsi="Microsoft JhengHei"/>
+                <w:color w:val="26221D"/>
+                <w:sz w:val="20"/>
+                <w:szCs w:val="20"/>
+              </w:rPr>
+              <w:t xml:space="preserve">4</w:t>
+            </w:r>
+          </w:p>
+        </w:tc>
+        <w:tc>
+          <w:tcPr>
+            <w:tcW w:type="dxa" w:w="8450"/>
+            <w:shd w:fill="FBFAF6" w:val="clear"/>
+            <w:tcMar>
+              <w:top w:type="dxa" w:w="90"/>
+              <w:left w:type="dxa" w:w="120"/>
+              <w:bottom w:type="dxa" w:w="90"/>
+              <w:right w:type="dxa" w:w="120"/>
+            </w:tcMar>
+            <w:vAlign w:val="center"/>
+          </w:tcPr>
+          <w:p>
+            <w:pPr>
+              <w:jc w:val="left"/>
+            </w:pPr>
+            <w:r>
+              <w:rPr>
+                <w:rFonts w:ascii="Microsoft JhengHei" w:cs="Microsoft JhengHei" w:eastAsia="Microsoft JhengHei" w:hAnsi="Microsoft JhengHei"/>
+                <w:color w:val="26221D"/>
+                <w:sz w:val="20"/>
+                <w:szCs w:val="20"/>
+              </w:rPr>
+              <w:t xml:space="preserve">門店完成核銷，並將兌換數據回饋雙方，共同追蹤導流成效與後續優化</w:t>
+            </w:r>
+          </w:p>
+        </w:tc>
+      </w:tr>
+    </w:tbl>
+    <w:p>
+      <w:pPr>
+        <w:spacing w:after="160" w:line="320"/>
+      </w:pPr>
+      <w:r>
+        <w:rPr>
+          <w:rFonts w:ascii="Microsoft JhengHei" w:cs="Microsoft JhengHei" w:eastAsia="Microsoft JhengHei" w:hAnsi="Microsoft JhengHei"/>
+          <w:b w:val="false"/>
+          <w:bCs w:val="false"/>
+          <w:i w:val="false"/>
+          <w:iCs w:val="false"/>
+          <w:color w:val="26221D"/>
+          <w:sz w:val="21"/>
+          <w:szCs w:val="21"/>
+        </w:rPr>
+        <w:t xml:space="preserve">執行時機：建議優先於九週年慶檔期試行（與檔期加碼行銷同步推出，強化線上線下綜效），視兌換與導流成效，再評估擴大至雙十一檔期及後續常態化合作。</w:t>
+      </w:r>
+    </w:p>
+    <w:p>
+      <w:pPr>
+        <w:spacing w:after="160" w:line="320"/>
+      </w:pPr>
+      <w:r>
+        <w:rPr>
+          <w:rFonts w:ascii="Microsoft JhengHei" w:cs="Microsoft JhengHei" w:eastAsia="Microsoft JhengHei" w:hAnsi="Microsoft JhengHei"/>
+          <w:b w:val="false"/>
+          <w:bCs w:val="false"/>
+          <w:i w:val="false"/>
+          <w:iCs w:val="false"/>
+          <w:color w:val="6B6355"/>
+          <w:sz w:val="17"/>
+          <w:szCs w:val="17"/>
+        </w:rPr>
+        <w:t xml:space="preserve">分工與待確認事項：阿爾法市場部將與現行票券發行商（宜叡）進行系統端與核銷端之評估與串接；MOMO 端則需支援訂單成立後之自動派券機制（MOMO 於前次洽談中已表示技術層面可行）。虛擬券面額、發放門檻與預期兌換率待雙方三方會議（阿爾法／MOMO／宜叡）確認後，可另行補充本方案之量化增量業績測算。</w:t>
+      </w:r>
+    </w:p>
+    <w:p>
+      <w:pPr>
+        <w:pStyle w:val="Heading1"/>
+        <w:pBdr>
+          <w:bottom w:val="single" w:color="0E8F62" w:sz="10" w:space="6"/>
+        </w:pBdr>
+        <w:spacing w:after="160" w:before="320"/>
+      </w:pPr>
+      <w:r>
+        <w:rPr>
+          <w:rFonts w:ascii="Microsoft JhengHei" w:cs="Microsoft JhengHei" w:eastAsia="Microsoft JhengHei" w:hAnsi="Microsoft JhengHei"/>
+          <w:b/>
+          <w:bCs/>
+          <w:color w:val="26221D"/>
+          <w:sz w:val="30"/>
+          <w:szCs w:val="30"/>
+        </w:rPr>
+        <w:t xml:space="preserve">四、逐月測算總表（含檔期加碼）</w:t>
       </w:r>
     </w:p>
     <w:tbl>
@@ -1949,7 +2323,7 @@
           <w:sz w:val="30"/>
           <w:szCs w:val="30"/>
         </w:rPr>
-        <w:t xml:space="preserve">四、檔期加碼效益測算</w:t>
+        <w:t xml:space="preserve">五、檔期加碼效益測算</w:t>
       </w:r>
     </w:p>
     <w:p>
@@ -2867,7 +3241,7 @@
           <w:sz w:val="30"/>
           <w:szCs w:val="30"/>
         </w:rPr>
-        <w:t xml:space="preserve">五、整體效益總覽（5 個月，含檔期加碼）</w:t>
+        <w:t xml:space="preserve">六、整體效益總覽（5 個月，含檔期加碼）</w:t>
       </w:r>
     </w:p>
     <w:tbl>
@@ -3128,7 +3502,7 @@
           <w:sz w:val="30"/>
           <w:szCs w:val="30"/>
         </w:rPr>
-        <w:t xml:space="preserve">六、給 MOMO 的資源需求與結論訴求</w:t>
+        <w:t xml:space="preserve">七、給 MOMO 的資源需求與結論訴求</w:t>
       </w:r>
     </w:p>
     <w:p>
@@ -3146,7 +3520,7 @@
           <w:sz w:val="21"/>
           <w:szCs w:val="21"/>
         </w:rPr>
-        <w:t xml:space="preserve">阿爾法在此方案中承諾於兩大檔期主動加碼、自負行銷投入風險，目的是把 MOMO 平台的檔期流量轉化為實際業績，也讓 MOMO 在檔期期間收到的抽成金額同步放大。基於此，我方期待 MOMO 提供以下對應資源，讓雙方投入形成加乘效果：</w:t>
+        <w:t xml:space="preserve">阿爾法在此方案中承諾於兩大檔期主動加碼、自負行銷投入風險，並額外導入 O2O 導流機制，目的是把 MOMO 平台的檔期流量轉化為實際業績與實體門店客流，也讓 MOMO 在檔期期間收到的抽成金額同步放大。基於此，我方期待 MOMO 提供以下對應資源，讓雙方投入形成加乘效果：</w:t>
       </w:r>
     </w:p>
     <w:p>
@@ -3215,7 +3589,30 @@
           <w:sz w:val="21"/>
           <w:szCs w:val="21"/>
         </w:rPr>
-        <w:t xml:space="preserve">維持既有降抽成與差額回投行銷之核心方案（26.5% → 10.0%，差額 1:1 全數回投），作為長期合作基礎，本檔期加碼為此基礎之上的額外投入。</w:t>
+        <w:t xml:space="preserve">技術面支援訂單成立後之虛擬券自動派發機制，並協助安排阿爾法／MOMO／票券發行商（宜叡）三方系統串接會議，確認核銷與數據回饋流程。</w:t>
+      </w:r>
+    </w:p>
+    <w:p>
+      <w:pPr>
+        <w:pStyle w:val="ListParagraph"/>
+        <w:numPr>
+          <w:ilvl w:val="0"/>
+          <w:numId w:val="2"/>
+        </w:numPr>
+        <w:spacing w:after="120" w:line="320"/>
+      </w:pPr>
+      <w:r>
+        <w:rPr>
+          <w:rFonts w:ascii="Microsoft JhengHei" w:cs="Microsoft JhengHei" w:eastAsia="Microsoft JhengHei" w:hAnsi="Microsoft JhengHei"/>
+          <w:b w:val="false"/>
+          <w:bCs w:val="false"/>
+          <w:i w:val="false"/>
+          <w:iCs w:val="false"/>
+          <w:color w:val="26221D"/>
+          <w:sz w:val="21"/>
+          <w:szCs w:val="21"/>
+        </w:rPr>
+        <w:t xml:space="preserve">維持既有降抽成與差額回投行銷之核心方案（26.5% → 10.0%，差額 1:1 全數回投），作為長期合作基礎，本檔期加碼與 O2O 導流為此基礎之上的額外投入。</w:t>
       </w:r>
     </w:p>
     <w:p>

</xml_diff>